<commit_message>
ADNOCDIST: rendered PDFs, and keep table rows whole across page breaks
The study renders to 35 pages carrying all eight figures; the bibliography to 27.
Reading the rendered study back showed a table row splitting across a page
boundary and stranding a single wrapped word at the top of the next page, so
rows are now marked non-splitting in the house style module.
</commit_message>
<xml_diff>
--- a/engine/adnocdist_study/ADNOCDIST_Bibliography_09-08-2026.docx
+++ b/engine/adnocdist_study/ADNOCDIST_Bibliography_09-08-2026.docx
@@ -230,6 +230,9 @@
         <w:gridCol w:w="5544"/>
       </w:tblGrid>
       <w:tr>
+        <w:trPr>
+          <w:cantSplit/>
+        </w:trPr>
         <w:tc>
           <w:tcPr>
             <w:tcW w:type="dxa" w:w="547"/>
@@ -308,6 +311,9 @@
         </w:tc>
       </w:tr>
       <w:tr>
+        <w:trPr>
+          <w:cantSplit/>
+        </w:trPr>
         <w:tc>
           <w:tcPr>
             <w:tcW w:type="dxa" w:w="547"/>
@@ -381,6 +387,9 @@
         </w:tc>
       </w:tr>
       <w:tr>
+        <w:trPr>
+          <w:cantSplit/>
+        </w:trPr>
         <w:tc>
           <w:tcPr>
             <w:tcW w:type="dxa" w:w="547"/>
@@ -454,6 +463,9 @@
         </w:tc>
       </w:tr>
       <w:tr>
+        <w:trPr>
+          <w:cantSplit/>
+        </w:trPr>
         <w:tc>
           <w:tcPr>
             <w:tcW w:type="dxa" w:w="547"/>
@@ -527,6 +539,9 @@
         </w:tc>
       </w:tr>
       <w:tr>
+        <w:trPr>
+          <w:cantSplit/>
+        </w:trPr>
         <w:tc>
           <w:tcPr>
             <w:tcW w:type="dxa" w:w="547"/>
@@ -600,6 +615,9 @@
         </w:tc>
       </w:tr>
       <w:tr>
+        <w:trPr>
+          <w:cantSplit/>
+        </w:trPr>
         <w:tc>
           <w:tcPr>
             <w:tcW w:type="dxa" w:w="547"/>
@@ -673,6 +691,9 @@
         </w:tc>
       </w:tr>
       <w:tr>
+        <w:trPr>
+          <w:cantSplit/>
+        </w:trPr>
         <w:tc>
           <w:tcPr>
             <w:tcW w:type="dxa" w:w="547"/>
@@ -746,6 +767,9 @@
         </w:tc>
       </w:tr>
       <w:tr>
+        <w:trPr>
+          <w:cantSplit/>
+        </w:trPr>
         <w:tc>
           <w:tcPr>
             <w:tcW w:type="dxa" w:w="547"/>
@@ -819,6 +843,9 @@
         </w:tc>
       </w:tr>
       <w:tr>
+        <w:trPr>
+          <w:cantSplit/>
+        </w:trPr>
         <w:tc>
           <w:tcPr>
             <w:tcW w:type="dxa" w:w="547"/>
@@ -892,6 +919,9 @@
         </w:tc>
       </w:tr>
       <w:tr>
+        <w:trPr>
+          <w:cantSplit/>
+        </w:trPr>
         <w:tc>
           <w:tcPr>
             <w:tcW w:type="dxa" w:w="547"/>
@@ -965,6 +995,9 @@
         </w:tc>
       </w:tr>
       <w:tr>
+        <w:trPr>
+          <w:cantSplit/>
+        </w:trPr>
         <w:tc>
           <w:tcPr>
             <w:tcW w:type="dxa" w:w="547"/>
@@ -1038,6 +1071,9 @@
         </w:tc>
       </w:tr>
       <w:tr>
+        <w:trPr>
+          <w:cantSplit/>
+        </w:trPr>
         <w:tc>
           <w:tcPr>
             <w:tcW w:type="dxa" w:w="547"/>
@@ -1111,6 +1147,9 @@
         </w:tc>
       </w:tr>
       <w:tr>
+        <w:trPr>
+          <w:cantSplit/>
+        </w:trPr>
         <w:tc>
           <w:tcPr>
             <w:tcW w:type="dxa" w:w="547"/>
@@ -1245,6 +1284,9 @@
         <w:gridCol w:w="5760"/>
       </w:tblGrid>
       <w:tr>
+        <w:trPr>
+          <w:cantSplit/>
+        </w:trPr>
         <w:tc>
           <w:tcPr>
             <w:tcW w:type="dxa" w:w="3528"/>
@@ -1304,6 +1346,9 @@
         </w:tc>
       </w:tr>
       <w:tr>
+        <w:trPr>
+          <w:cantSplit/>
+        </w:trPr>
         <w:tc>
           <w:tcPr>
             <w:tcW w:type="dxa" w:w="3528"/>
@@ -1359,6 +1404,9 @@
         </w:tc>
       </w:tr>
       <w:tr>
+        <w:trPr>
+          <w:cantSplit/>
+        </w:trPr>
         <w:tc>
           <w:tcPr>
             <w:tcW w:type="dxa" w:w="3528"/>
@@ -1414,6 +1462,9 @@
         </w:tc>
       </w:tr>
       <w:tr>
+        <w:trPr>
+          <w:cantSplit/>
+        </w:trPr>
         <w:tc>
           <w:tcPr>
             <w:tcW w:type="dxa" w:w="3528"/>
@@ -1469,6 +1520,9 @@
         </w:tc>
       </w:tr>
       <w:tr>
+        <w:trPr>
+          <w:cantSplit/>
+        </w:trPr>
         <w:tc>
           <w:tcPr>
             <w:tcW w:type="dxa" w:w="3528"/>
@@ -1600,6 +1654,9 @@
         <w:gridCol w:w="4248"/>
       </w:tblGrid>
       <w:tr>
+        <w:trPr>
+          <w:cantSplit/>
+        </w:trPr>
         <w:tc>
           <w:tcPr>
             <w:tcW w:type="dxa" w:w="605"/>
@@ -1678,6 +1735,9 @@
         </w:tc>
       </w:tr>
       <w:tr>
+        <w:trPr>
+          <w:cantSplit/>
+        </w:trPr>
         <w:tc>
           <w:tcPr>
             <w:tcW w:type="dxa" w:w="605"/>
@@ -1755,6 +1815,9 @@
         </w:tc>
       </w:tr>
       <w:tr>
+        <w:trPr>
+          <w:cantSplit/>
+        </w:trPr>
         <w:tc>
           <w:tcPr>
             <w:tcW w:type="dxa" w:w="605"/>
@@ -1832,6 +1895,9 @@
         </w:tc>
       </w:tr>
       <w:tr>
+        <w:trPr>
+          <w:cantSplit/>
+        </w:trPr>
         <w:tc>
           <w:tcPr>
             <w:tcW w:type="dxa" w:w="605"/>
@@ -1909,6 +1975,9 @@
         </w:tc>
       </w:tr>
       <w:tr>
+        <w:trPr>
+          <w:cantSplit/>
+        </w:trPr>
         <w:tc>
           <w:tcPr>
             <w:tcW w:type="dxa" w:w="605"/>
@@ -1986,6 +2055,9 @@
         </w:tc>
       </w:tr>
       <w:tr>
+        <w:trPr>
+          <w:cantSplit/>
+        </w:trPr>
         <w:tc>
           <w:tcPr>
             <w:tcW w:type="dxa" w:w="605"/>
@@ -2063,6 +2135,9 @@
         </w:tc>
       </w:tr>
       <w:tr>
+        <w:trPr>
+          <w:cantSplit/>
+        </w:trPr>
         <w:tc>
           <w:tcPr>
             <w:tcW w:type="dxa" w:w="605"/>
@@ -2140,6 +2215,9 @@
         </w:tc>
       </w:tr>
       <w:tr>
+        <w:trPr>
+          <w:cantSplit/>
+        </w:trPr>
         <w:tc>
           <w:tcPr>
             <w:tcW w:type="dxa" w:w="605"/>
@@ -2217,6 +2295,9 @@
         </w:tc>
       </w:tr>
       <w:tr>
+        <w:trPr>
+          <w:cantSplit/>
+        </w:trPr>
         <w:tc>
           <w:tcPr>
             <w:tcW w:type="dxa" w:w="605"/>
@@ -2294,6 +2375,9 @@
         </w:tc>
       </w:tr>
       <w:tr>
+        <w:trPr>
+          <w:cantSplit/>
+        </w:trPr>
         <w:tc>
           <w:tcPr>
             <w:tcW w:type="dxa" w:w="605"/>
@@ -2371,6 +2455,9 @@
         </w:tc>
       </w:tr>
       <w:tr>
+        <w:trPr>
+          <w:cantSplit/>
+        </w:trPr>
         <w:tc>
           <w:tcPr>
             <w:tcW w:type="dxa" w:w="605"/>
@@ -2448,6 +2535,9 @@
         </w:tc>
       </w:tr>
       <w:tr>
+        <w:trPr>
+          <w:cantSplit/>
+        </w:trPr>
         <w:tc>
           <w:tcPr>
             <w:tcW w:type="dxa" w:w="605"/>
@@ -2525,6 +2615,9 @@
         </w:tc>
       </w:tr>
       <w:tr>
+        <w:trPr>
+          <w:cantSplit/>
+        </w:trPr>
         <w:tc>
           <w:tcPr>
             <w:tcW w:type="dxa" w:w="605"/>
@@ -2602,6 +2695,9 @@
         </w:tc>
       </w:tr>
       <w:tr>
+        <w:trPr>
+          <w:cantSplit/>
+        </w:trPr>
         <w:tc>
           <w:tcPr>
             <w:tcW w:type="dxa" w:w="605"/>
@@ -2679,6 +2775,9 @@
         </w:tc>
       </w:tr>
       <w:tr>
+        <w:trPr>
+          <w:cantSplit/>
+        </w:trPr>
         <w:tc>
           <w:tcPr>
             <w:tcW w:type="dxa" w:w="605"/>
@@ -2756,6 +2855,9 @@
         </w:tc>
       </w:tr>
       <w:tr>
+        <w:trPr>
+          <w:cantSplit/>
+        </w:trPr>
         <w:tc>
           <w:tcPr>
             <w:tcW w:type="dxa" w:w="605"/>
@@ -2833,6 +2935,9 @@
         </w:tc>
       </w:tr>
       <w:tr>
+        <w:trPr>
+          <w:cantSplit/>
+        </w:trPr>
         <w:tc>
           <w:tcPr>
             <w:tcW w:type="dxa" w:w="605"/>
@@ -2910,6 +3015,9 @@
         </w:tc>
       </w:tr>
       <w:tr>
+        <w:trPr>
+          <w:cantSplit/>
+        </w:trPr>
         <w:tc>
           <w:tcPr>
             <w:tcW w:type="dxa" w:w="605"/>
@@ -2987,6 +3095,9 @@
         </w:tc>
       </w:tr>
       <w:tr>
+        <w:trPr>
+          <w:cantSplit/>
+        </w:trPr>
         <w:tc>
           <w:tcPr>
             <w:tcW w:type="dxa" w:w="605"/>
@@ -3064,6 +3175,9 @@
         </w:tc>
       </w:tr>
       <w:tr>
+        <w:trPr>
+          <w:cantSplit/>
+        </w:trPr>
         <w:tc>
           <w:tcPr>
             <w:tcW w:type="dxa" w:w="605"/>
@@ -3141,6 +3255,9 @@
         </w:tc>
       </w:tr>
       <w:tr>
+        <w:trPr>
+          <w:cantSplit/>
+        </w:trPr>
         <w:tc>
           <w:tcPr>
             <w:tcW w:type="dxa" w:w="605"/>
@@ -3218,6 +3335,9 @@
         </w:tc>
       </w:tr>
       <w:tr>
+        <w:trPr>
+          <w:cantSplit/>
+        </w:trPr>
         <w:tc>
           <w:tcPr>
             <w:tcW w:type="dxa" w:w="605"/>
@@ -3295,6 +3415,9 @@
         </w:tc>
       </w:tr>
       <w:tr>
+        <w:trPr>
+          <w:cantSplit/>
+        </w:trPr>
         <w:tc>
           <w:tcPr>
             <w:tcW w:type="dxa" w:w="605"/>
@@ -3372,6 +3495,9 @@
         </w:tc>
       </w:tr>
       <w:tr>
+        <w:trPr>
+          <w:cantSplit/>
+        </w:trPr>
         <w:tc>
           <w:tcPr>
             <w:tcW w:type="dxa" w:w="605"/>
@@ -3449,6 +3575,9 @@
         </w:tc>
       </w:tr>
       <w:tr>
+        <w:trPr>
+          <w:cantSplit/>
+        </w:trPr>
         <w:tc>
           <w:tcPr>
             <w:tcW w:type="dxa" w:w="605"/>
@@ -3526,6 +3655,9 @@
         </w:tc>
       </w:tr>
       <w:tr>
+        <w:trPr>
+          <w:cantSplit/>
+        </w:trPr>
         <w:tc>
           <w:tcPr>
             <w:tcW w:type="dxa" w:w="605"/>
@@ -3603,6 +3735,9 @@
         </w:tc>
       </w:tr>
       <w:tr>
+        <w:trPr>
+          <w:cantSplit/>
+        </w:trPr>
         <w:tc>
           <w:tcPr>
             <w:tcW w:type="dxa" w:w="605"/>
@@ -3680,6 +3815,9 @@
         </w:tc>
       </w:tr>
       <w:tr>
+        <w:trPr>
+          <w:cantSplit/>
+        </w:trPr>
         <w:tc>
           <w:tcPr>
             <w:tcW w:type="dxa" w:w="605"/>
@@ -3757,6 +3895,9 @@
         </w:tc>
       </w:tr>
       <w:tr>
+        <w:trPr>
+          <w:cantSplit/>
+        </w:trPr>
         <w:tc>
           <w:tcPr>
             <w:tcW w:type="dxa" w:w="605"/>
@@ -3834,6 +3975,9 @@
         </w:tc>
       </w:tr>
       <w:tr>
+        <w:trPr>
+          <w:cantSplit/>
+        </w:trPr>
         <w:tc>
           <w:tcPr>
             <w:tcW w:type="dxa" w:w="605"/>
@@ -3911,6 +4055,9 @@
         </w:tc>
       </w:tr>
       <w:tr>
+        <w:trPr>
+          <w:cantSplit/>
+        </w:trPr>
         <w:tc>
           <w:tcPr>
             <w:tcW w:type="dxa" w:w="605"/>
@@ -3988,6 +4135,9 @@
         </w:tc>
       </w:tr>
       <w:tr>
+        <w:trPr>
+          <w:cantSplit/>
+        </w:trPr>
         <w:tc>
           <w:tcPr>
             <w:tcW w:type="dxa" w:w="605"/>
@@ -4065,6 +4215,9 @@
         </w:tc>
       </w:tr>
       <w:tr>
+        <w:trPr>
+          <w:cantSplit/>
+        </w:trPr>
         <w:tc>
           <w:tcPr>
             <w:tcW w:type="dxa" w:w="605"/>
@@ -4142,6 +4295,9 @@
         </w:tc>
       </w:tr>
       <w:tr>
+        <w:trPr>
+          <w:cantSplit/>
+        </w:trPr>
         <w:tc>
           <w:tcPr>
             <w:tcW w:type="dxa" w:w="605"/>
@@ -4219,6 +4375,9 @@
         </w:tc>
       </w:tr>
       <w:tr>
+        <w:trPr>
+          <w:cantSplit/>
+        </w:trPr>
         <w:tc>
           <w:tcPr>
             <w:tcW w:type="dxa" w:w="605"/>
@@ -4296,6 +4455,9 @@
         </w:tc>
       </w:tr>
       <w:tr>
+        <w:trPr>
+          <w:cantSplit/>
+        </w:trPr>
         <w:tc>
           <w:tcPr>
             <w:tcW w:type="dxa" w:w="605"/>
@@ -4373,6 +4535,9 @@
         </w:tc>
       </w:tr>
       <w:tr>
+        <w:trPr>
+          <w:cantSplit/>
+        </w:trPr>
         <w:tc>
           <w:tcPr>
             <w:tcW w:type="dxa" w:w="605"/>
@@ -4450,6 +4615,9 @@
         </w:tc>
       </w:tr>
       <w:tr>
+        <w:trPr>
+          <w:cantSplit/>
+        </w:trPr>
         <w:tc>
           <w:tcPr>
             <w:tcW w:type="dxa" w:w="605"/>
@@ -4527,6 +4695,9 @@
         </w:tc>
       </w:tr>
       <w:tr>
+        <w:trPr>
+          <w:cantSplit/>
+        </w:trPr>
         <w:tc>
           <w:tcPr>
             <w:tcW w:type="dxa" w:w="605"/>
@@ -4604,6 +4775,9 @@
         </w:tc>
       </w:tr>
       <w:tr>
+        <w:trPr>
+          <w:cantSplit/>
+        </w:trPr>
         <w:tc>
           <w:tcPr>
             <w:tcW w:type="dxa" w:w="605"/>
@@ -4681,6 +4855,9 @@
         </w:tc>
       </w:tr>
       <w:tr>
+        <w:trPr>
+          <w:cantSplit/>
+        </w:trPr>
         <w:tc>
           <w:tcPr>
             <w:tcW w:type="dxa" w:w="605"/>
@@ -4758,6 +4935,9 @@
         </w:tc>
       </w:tr>
       <w:tr>
+        <w:trPr>
+          <w:cantSplit/>
+        </w:trPr>
         <w:tc>
           <w:tcPr>
             <w:tcW w:type="dxa" w:w="605"/>
@@ -4835,6 +5015,9 @@
         </w:tc>
       </w:tr>
       <w:tr>
+        <w:trPr>
+          <w:cantSplit/>
+        </w:trPr>
         <w:tc>
           <w:tcPr>
             <w:tcW w:type="dxa" w:w="605"/>
@@ -4912,6 +5095,9 @@
         </w:tc>
       </w:tr>
       <w:tr>
+        <w:trPr>
+          <w:cantSplit/>
+        </w:trPr>
         <w:tc>
           <w:tcPr>
             <w:tcW w:type="dxa" w:w="605"/>
@@ -4989,6 +5175,9 @@
         </w:tc>
       </w:tr>
       <w:tr>
+        <w:trPr>
+          <w:cantSplit/>
+        </w:trPr>
         <w:tc>
           <w:tcPr>
             <w:tcW w:type="dxa" w:w="605"/>
@@ -5066,6 +5255,9 @@
         </w:tc>
       </w:tr>
       <w:tr>
+        <w:trPr>
+          <w:cantSplit/>
+        </w:trPr>
         <w:tc>
           <w:tcPr>
             <w:tcW w:type="dxa" w:w="605"/>
@@ -5143,6 +5335,9 @@
         </w:tc>
       </w:tr>
       <w:tr>
+        <w:trPr>
+          <w:cantSplit/>
+        </w:trPr>
         <w:tc>
           <w:tcPr>
             <w:tcW w:type="dxa" w:w="605"/>
@@ -5220,6 +5415,9 @@
         </w:tc>
       </w:tr>
       <w:tr>
+        <w:trPr>
+          <w:cantSplit/>
+        </w:trPr>
         <w:tc>
           <w:tcPr>
             <w:tcW w:type="dxa" w:w="605"/>
@@ -5297,6 +5495,9 @@
         </w:tc>
       </w:tr>
       <w:tr>
+        <w:trPr>
+          <w:cantSplit/>
+        </w:trPr>
         <w:tc>
           <w:tcPr>
             <w:tcW w:type="dxa" w:w="605"/>
@@ -5374,6 +5575,9 @@
         </w:tc>
       </w:tr>
       <w:tr>
+        <w:trPr>
+          <w:cantSplit/>
+        </w:trPr>
         <w:tc>
           <w:tcPr>
             <w:tcW w:type="dxa" w:w="605"/>
@@ -5451,6 +5655,9 @@
         </w:tc>
       </w:tr>
       <w:tr>
+        <w:trPr>
+          <w:cantSplit/>
+        </w:trPr>
         <w:tc>
           <w:tcPr>
             <w:tcW w:type="dxa" w:w="605"/>
@@ -5528,6 +5735,9 @@
         </w:tc>
       </w:tr>
       <w:tr>
+        <w:trPr>
+          <w:cantSplit/>
+        </w:trPr>
         <w:tc>
           <w:tcPr>
             <w:tcW w:type="dxa" w:w="605"/>
@@ -5605,6 +5815,9 @@
         </w:tc>
       </w:tr>
       <w:tr>
+        <w:trPr>
+          <w:cantSplit/>
+        </w:trPr>
         <w:tc>
           <w:tcPr>
             <w:tcW w:type="dxa" w:w="605"/>
@@ -5682,6 +5895,9 @@
         </w:tc>
       </w:tr>
       <w:tr>
+        <w:trPr>
+          <w:cantSplit/>
+        </w:trPr>
         <w:tc>
           <w:tcPr>
             <w:tcW w:type="dxa" w:w="605"/>
@@ -5759,6 +5975,9 @@
         </w:tc>
       </w:tr>
       <w:tr>
+        <w:trPr>
+          <w:cantSplit/>
+        </w:trPr>
         <w:tc>
           <w:tcPr>
             <w:tcW w:type="dxa" w:w="605"/>
@@ -5836,6 +6055,9 @@
         </w:tc>
       </w:tr>
       <w:tr>
+        <w:trPr>
+          <w:cantSplit/>
+        </w:trPr>
         <w:tc>
           <w:tcPr>
             <w:tcW w:type="dxa" w:w="605"/>
@@ -6031,6 +6253,9 @@
         <w:gridCol w:w="6048"/>
       </w:tblGrid>
       <w:tr>
+        <w:trPr>
+          <w:cantSplit/>
+        </w:trPr>
         <w:tc>
           <w:tcPr>
             <w:tcW w:type="dxa" w:w="1656"/>
@@ -6109,6 +6334,9 @@
         </w:tc>
       </w:tr>
       <w:tr>
+        <w:trPr>
+          <w:cantSplit/>
+        </w:trPr>
         <w:tc>
           <w:tcPr>
             <w:tcW w:type="dxa" w:w="1656"/>
@@ -6179,6 +6407,9 @@
         </w:tc>
       </w:tr>
       <w:tr>
+        <w:trPr>
+          <w:cantSplit/>
+        </w:trPr>
         <w:tc>
           <w:tcPr>
             <w:tcW w:type="dxa" w:w="1656"/>
@@ -6249,6 +6480,9 @@
         </w:tc>
       </w:tr>
       <w:tr>
+        <w:trPr>
+          <w:cantSplit/>
+        </w:trPr>
         <w:tc>
           <w:tcPr>
             <w:tcW w:type="dxa" w:w="1656"/>
@@ -6319,6 +6553,9 @@
         </w:tc>
       </w:tr>
       <w:tr>
+        <w:trPr>
+          <w:cantSplit/>
+        </w:trPr>
         <w:tc>
           <w:tcPr>
             <w:tcW w:type="dxa" w:w="1656"/>
@@ -6465,6 +6702,9 @@
         <w:gridCol w:w="6048"/>
       </w:tblGrid>
       <w:tr>
+        <w:trPr>
+          <w:cantSplit/>
+        </w:trPr>
         <w:tc>
           <w:tcPr>
             <w:tcW w:type="dxa" w:w="1656"/>
@@ -6543,6 +6783,9 @@
         </w:tc>
       </w:tr>
       <w:tr>
+        <w:trPr>
+          <w:cantSplit/>
+        </w:trPr>
         <w:tc>
           <w:tcPr>
             <w:tcW w:type="dxa" w:w="1656"/>
@@ -6613,6 +6856,9 @@
         </w:tc>
       </w:tr>
       <w:tr>
+        <w:trPr>
+          <w:cantSplit/>
+        </w:trPr>
         <w:tc>
           <w:tcPr>
             <w:tcW w:type="dxa" w:w="1656"/>
@@ -6683,6 +6929,9 @@
         </w:tc>
       </w:tr>
       <w:tr>
+        <w:trPr>
+          <w:cantSplit/>
+        </w:trPr>
         <w:tc>
           <w:tcPr>
             <w:tcW w:type="dxa" w:w="1656"/>
@@ -6753,6 +7002,9 @@
         </w:tc>
       </w:tr>
       <w:tr>
+        <w:trPr>
+          <w:cantSplit/>
+        </w:trPr>
         <w:tc>
           <w:tcPr>
             <w:tcW w:type="dxa" w:w="1656"/>
@@ -6823,6 +7075,9 @@
         </w:tc>
       </w:tr>
       <w:tr>
+        <w:trPr>
+          <w:cantSplit/>
+        </w:trPr>
         <w:tc>
           <w:tcPr>
             <w:tcW w:type="dxa" w:w="1656"/>
@@ -6893,6 +7148,9 @@
         </w:tc>
       </w:tr>
       <w:tr>
+        <w:trPr>
+          <w:cantSplit/>
+        </w:trPr>
         <w:tc>
           <w:tcPr>
             <w:tcW w:type="dxa" w:w="1656"/>
@@ -6963,6 +7221,9 @@
         </w:tc>
       </w:tr>
       <w:tr>
+        <w:trPr>
+          <w:cantSplit/>
+        </w:trPr>
         <w:tc>
           <w:tcPr>
             <w:tcW w:type="dxa" w:w="1656"/>
@@ -7033,6 +7294,9 @@
         </w:tc>
       </w:tr>
       <w:tr>
+        <w:trPr>
+          <w:cantSplit/>
+        </w:trPr>
         <w:tc>
           <w:tcPr>
             <w:tcW w:type="dxa" w:w="1656"/>
@@ -7103,6 +7367,9 @@
         </w:tc>
       </w:tr>
       <w:tr>
+        <w:trPr>
+          <w:cantSplit/>
+        </w:trPr>
         <w:tc>
           <w:tcPr>
             <w:tcW w:type="dxa" w:w="1656"/>
@@ -7173,6 +7440,9 @@
         </w:tc>
       </w:tr>
       <w:tr>
+        <w:trPr>
+          <w:cantSplit/>
+        </w:trPr>
         <w:tc>
           <w:tcPr>
             <w:tcW w:type="dxa" w:w="1656"/>
@@ -7243,6 +7513,9 @@
         </w:tc>
       </w:tr>
       <w:tr>
+        <w:trPr>
+          <w:cantSplit/>
+        </w:trPr>
         <w:tc>
           <w:tcPr>
             <w:tcW w:type="dxa" w:w="1656"/>
@@ -7313,6 +7586,9 @@
         </w:tc>
       </w:tr>
       <w:tr>
+        <w:trPr>
+          <w:cantSplit/>
+        </w:trPr>
         <w:tc>
           <w:tcPr>
             <w:tcW w:type="dxa" w:w="1656"/>
@@ -7383,6 +7659,9 @@
         </w:tc>
       </w:tr>
       <w:tr>
+        <w:trPr>
+          <w:cantSplit/>
+        </w:trPr>
         <w:tc>
           <w:tcPr>
             <w:tcW w:type="dxa" w:w="1656"/>
@@ -7453,6 +7732,9 @@
         </w:tc>
       </w:tr>
       <w:tr>
+        <w:trPr>
+          <w:cantSplit/>
+        </w:trPr>
         <w:tc>
           <w:tcPr>
             <w:tcW w:type="dxa" w:w="1656"/>
@@ -7523,6 +7805,9 @@
         </w:tc>
       </w:tr>
       <w:tr>
+        <w:trPr>
+          <w:cantSplit/>
+        </w:trPr>
         <w:tc>
           <w:tcPr>
             <w:tcW w:type="dxa" w:w="1656"/>
@@ -7593,6 +7878,9 @@
         </w:tc>
       </w:tr>
       <w:tr>
+        <w:trPr>
+          <w:cantSplit/>
+        </w:trPr>
         <w:tc>
           <w:tcPr>
             <w:tcW w:type="dxa" w:w="1656"/>
@@ -7663,6 +7951,9 @@
         </w:tc>
       </w:tr>
       <w:tr>
+        <w:trPr>
+          <w:cantSplit/>
+        </w:trPr>
         <w:tc>
           <w:tcPr>
             <w:tcW w:type="dxa" w:w="1656"/>
@@ -7733,6 +8024,9 @@
         </w:tc>
       </w:tr>
       <w:tr>
+        <w:trPr>
+          <w:cantSplit/>
+        </w:trPr>
         <w:tc>
           <w:tcPr>
             <w:tcW w:type="dxa" w:w="1656"/>
@@ -7803,6 +8097,9 @@
         </w:tc>
       </w:tr>
       <w:tr>
+        <w:trPr>
+          <w:cantSplit/>
+        </w:trPr>
         <w:tc>
           <w:tcPr>
             <w:tcW w:type="dxa" w:w="1656"/>
@@ -7873,6 +8170,9 @@
         </w:tc>
       </w:tr>
       <w:tr>
+        <w:trPr>
+          <w:cantSplit/>
+        </w:trPr>
         <w:tc>
           <w:tcPr>
             <w:tcW w:type="dxa" w:w="1656"/>
@@ -7943,6 +8243,9 @@
         </w:tc>
       </w:tr>
       <w:tr>
+        <w:trPr>
+          <w:cantSplit/>
+        </w:trPr>
         <w:tc>
           <w:tcPr>
             <w:tcW w:type="dxa" w:w="1656"/>
@@ -8013,6 +8316,9 @@
         </w:tc>
       </w:tr>
       <w:tr>
+        <w:trPr>
+          <w:cantSplit/>
+        </w:trPr>
         <w:tc>
           <w:tcPr>
             <w:tcW w:type="dxa" w:w="1656"/>
@@ -8083,6 +8389,9 @@
         </w:tc>
       </w:tr>
       <w:tr>
+        <w:trPr>
+          <w:cantSplit/>
+        </w:trPr>
         <w:tc>
           <w:tcPr>
             <w:tcW w:type="dxa" w:w="1656"/>
@@ -8153,6 +8462,9 @@
         </w:tc>
       </w:tr>
       <w:tr>
+        <w:trPr>
+          <w:cantSplit/>
+        </w:trPr>
         <w:tc>
           <w:tcPr>
             <w:tcW w:type="dxa" w:w="1656"/>
@@ -8223,6 +8535,9 @@
         </w:tc>
       </w:tr>
       <w:tr>
+        <w:trPr>
+          <w:cantSplit/>
+        </w:trPr>
         <w:tc>
           <w:tcPr>
             <w:tcW w:type="dxa" w:w="1656"/>
@@ -8293,6 +8608,9 @@
         </w:tc>
       </w:tr>
       <w:tr>
+        <w:trPr>
+          <w:cantSplit/>
+        </w:trPr>
         <w:tc>
           <w:tcPr>
             <w:tcW w:type="dxa" w:w="1656"/>
@@ -8363,6 +8681,9 @@
         </w:tc>
       </w:tr>
       <w:tr>
+        <w:trPr>
+          <w:cantSplit/>
+        </w:trPr>
         <w:tc>
           <w:tcPr>
             <w:tcW w:type="dxa" w:w="1656"/>
@@ -8433,6 +8754,9 @@
         </w:tc>
       </w:tr>
       <w:tr>
+        <w:trPr>
+          <w:cantSplit/>
+        </w:trPr>
         <w:tc>
           <w:tcPr>
             <w:tcW w:type="dxa" w:w="1656"/>
@@ -8503,6 +8827,9 @@
         </w:tc>
       </w:tr>
       <w:tr>
+        <w:trPr>
+          <w:cantSplit/>
+        </w:trPr>
         <w:tc>
           <w:tcPr>
             <w:tcW w:type="dxa" w:w="1656"/>
@@ -8573,6 +8900,9 @@
         </w:tc>
       </w:tr>
       <w:tr>
+        <w:trPr>
+          <w:cantSplit/>
+        </w:trPr>
         <w:tc>
           <w:tcPr>
             <w:tcW w:type="dxa" w:w="1656"/>
@@ -8643,6 +8973,9 @@
         </w:tc>
       </w:tr>
       <w:tr>
+        <w:trPr>
+          <w:cantSplit/>
+        </w:trPr>
         <w:tc>
           <w:tcPr>
             <w:tcW w:type="dxa" w:w="1656"/>
@@ -8713,6 +9046,9 @@
         </w:tc>
       </w:tr>
       <w:tr>
+        <w:trPr>
+          <w:cantSplit/>
+        </w:trPr>
         <w:tc>
           <w:tcPr>
             <w:tcW w:type="dxa" w:w="1656"/>
@@ -8783,6 +9119,9 @@
         </w:tc>
       </w:tr>
       <w:tr>
+        <w:trPr>
+          <w:cantSplit/>
+        </w:trPr>
         <w:tc>
           <w:tcPr>
             <w:tcW w:type="dxa" w:w="1656"/>
@@ -8853,6 +9192,9 @@
         </w:tc>
       </w:tr>
       <w:tr>
+        <w:trPr>
+          <w:cantSplit/>
+        </w:trPr>
         <w:tc>
           <w:tcPr>
             <w:tcW w:type="dxa" w:w="1656"/>
@@ -8923,6 +9265,9 @@
         </w:tc>
       </w:tr>
       <w:tr>
+        <w:trPr>
+          <w:cantSplit/>
+        </w:trPr>
         <w:tc>
           <w:tcPr>
             <w:tcW w:type="dxa" w:w="1656"/>
@@ -8993,6 +9338,9 @@
         </w:tc>
       </w:tr>
       <w:tr>
+        <w:trPr>
+          <w:cantSplit/>
+        </w:trPr>
         <w:tc>
           <w:tcPr>
             <w:tcW w:type="dxa" w:w="1656"/>
@@ -9063,6 +9411,9 @@
         </w:tc>
       </w:tr>
       <w:tr>
+        <w:trPr>
+          <w:cantSplit/>
+        </w:trPr>
         <w:tc>
           <w:tcPr>
             <w:tcW w:type="dxa" w:w="1656"/>
@@ -9133,6 +9484,9 @@
         </w:tc>
       </w:tr>
       <w:tr>
+        <w:trPr>
+          <w:cantSplit/>
+        </w:trPr>
         <w:tc>
           <w:tcPr>
             <w:tcW w:type="dxa" w:w="1656"/>
@@ -9203,6 +9557,9 @@
         </w:tc>
       </w:tr>
       <w:tr>
+        <w:trPr>
+          <w:cantSplit/>
+        </w:trPr>
         <w:tc>
           <w:tcPr>
             <w:tcW w:type="dxa" w:w="1656"/>
@@ -9273,6 +9630,9 @@
         </w:tc>
       </w:tr>
       <w:tr>
+        <w:trPr>
+          <w:cantSplit/>
+        </w:trPr>
         <w:tc>
           <w:tcPr>
             <w:tcW w:type="dxa" w:w="1656"/>
@@ -9343,6 +9703,9 @@
         </w:tc>
       </w:tr>
       <w:tr>
+        <w:trPr>
+          <w:cantSplit/>
+        </w:trPr>
         <w:tc>
           <w:tcPr>
             <w:tcW w:type="dxa" w:w="1656"/>
@@ -9413,6 +9776,9 @@
         </w:tc>
       </w:tr>
       <w:tr>
+        <w:trPr>
+          <w:cantSplit/>
+        </w:trPr>
         <w:tc>
           <w:tcPr>
             <w:tcW w:type="dxa" w:w="1656"/>
@@ -9483,6 +9849,9 @@
         </w:tc>
       </w:tr>
       <w:tr>
+        <w:trPr>
+          <w:cantSplit/>
+        </w:trPr>
         <w:tc>
           <w:tcPr>
             <w:tcW w:type="dxa" w:w="1656"/>
@@ -9553,6 +9922,9 @@
         </w:tc>
       </w:tr>
       <w:tr>
+        <w:trPr>
+          <w:cantSplit/>
+        </w:trPr>
         <w:tc>
           <w:tcPr>
             <w:tcW w:type="dxa" w:w="1656"/>
@@ -9623,6 +9995,9 @@
         </w:tc>
       </w:tr>
       <w:tr>
+        <w:trPr>
+          <w:cantSplit/>
+        </w:trPr>
         <w:tc>
           <w:tcPr>
             <w:tcW w:type="dxa" w:w="1656"/>
@@ -9693,6 +10068,9 @@
         </w:tc>
       </w:tr>
       <w:tr>
+        <w:trPr>
+          <w:cantSplit/>
+        </w:trPr>
         <w:tc>
           <w:tcPr>
             <w:tcW w:type="dxa" w:w="1656"/>
@@ -9763,6 +10141,9 @@
         </w:tc>
       </w:tr>
       <w:tr>
+        <w:trPr>
+          <w:cantSplit/>
+        </w:trPr>
         <w:tc>
           <w:tcPr>
             <w:tcW w:type="dxa" w:w="1656"/>
@@ -9833,6 +10214,9 @@
         </w:tc>
       </w:tr>
       <w:tr>
+        <w:trPr>
+          <w:cantSplit/>
+        </w:trPr>
         <w:tc>
           <w:tcPr>
             <w:tcW w:type="dxa" w:w="1656"/>
@@ -9903,6 +10287,9 @@
         </w:tc>
       </w:tr>
       <w:tr>
+        <w:trPr>
+          <w:cantSplit/>
+        </w:trPr>
         <w:tc>
           <w:tcPr>
             <w:tcW w:type="dxa" w:w="1656"/>
@@ -9973,6 +10360,9 @@
         </w:tc>
       </w:tr>
       <w:tr>
+        <w:trPr>
+          <w:cantSplit/>
+        </w:trPr>
         <w:tc>
           <w:tcPr>
             <w:tcW w:type="dxa" w:w="1656"/>
@@ -10043,6 +10433,9 @@
         </w:tc>
       </w:tr>
       <w:tr>
+        <w:trPr>
+          <w:cantSplit/>
+        </w:trPr>
         <w:tc>
           <w:tcPr>
             <w:tcW w:type="dxa" w:w="1656"/>
@@ -10113,6 +10506,9 @@
         </w:tc>
       </w:tr>
       <w:tr>
+        <w:trPr>
+          <w:cantSplit/>
+        </w:trPr>
         <w:tc>
           <w:tcPr>
             <w:tcW w:type="dxa" w:w="1656"/>
@@ -10183,6 +10579,9 @@
         </w:tc>
       </w:tr>
       <w:tr>
+        <w:trPr>
+          <w:cantSplit/>
+        </w:trPr>
         <w:tc>
           <w:tcPr>
             <w:tcW w:type="dxa" w:w="1656"/>
@@ -10253,6 +10652,9 @@
         </w:tc>
       </w:tr>
       <w:tr>
+        <w:trPr>
+          <w:cantSplit/>
+        </w:trPr>
         <w:tc>
           <w:tcPr>
             <w:tcW w:type="dxa" w:w="1656"/>
@@ -10323,6 +10725,9 @@
         </w:tc>
       </w:tr>
       <w:tr>
+        <w:trPr>
+          <w:cantSplit/>
+        </w:trPr>
         <w:tc>
           <w:tcPr>
             <w:tcW w:type="dxa" w:w="1656"/>
@@ -10393,6 +10798,9 @@
         </w:tc>
       </w:tr>
       <w:tr>
+        <w:trPr>
+          <w:cantSplit/>
+        </w:trPr>
         <w:tc>
           <w:tcPr>
             <w:tcW w:type="dxa" w:w="1656"/>
@@ -10463,6 +10871,9 @@
         </w:tc>
       </w:tr>
       <w:tr>
+        <w:trPr>
+          <w:cantSplit/>
+        </w:trPr>
         <w:tc>
           <w:tcPr>
             <w:tcW w:type="dxa" w:w="1656"/>
@@ -10533,6 +10944,9 @@
         </w:tc>
       </w:tr>
       <w:tr>
+        <w:trPr>
+          <w:cantSplit/>
+        </w:trPr>
         <w:tc>
           <w:tcPr>
             <w:tcW w:type="dxa" w:w="1656"/>
@@ -10603,6 +11017,9 @@
         </w:tc>
       </w:tr>
       <w:tr>
+        <w:trPr>
+          <w:cantSplit/>
+        </w:trPr>
         <w:tc>
           <w:tcPr>
             <w:tcW w:type="dxa" w:w="1656"/>
@@ -10673,6 +11090,9 @@
         </w:tc>
       </w:tr>
       <w:tr>
+        <w:trPr>
+          <w:cantSplit/>
+        </w:trPr>
         <w:tc>
           <w:tcPr>
             <w:tcW w:type="dxa" w:w="1656"/>
@@ -10743,6 +11163,9 @@
         </w:tc>
       </w:tr>
       <w:tr>
+        <w:trPr>
+          <w:cantSplit/>
+        </w:trPr>
         <w:tc>
           <w:tcPr>
             <w:tcW w:type="dxa" w:w="1656"/>
@@ -10813,6 +11236,9 @@
         </w:tc>
       </w:tr>
       <w:tr>
+        <w:trPr>
+          <w:cantSplit/>
+        </w:trPr>
         <w:tc>
           <w:tcPr>
             <w:tcW w:type="dxa" w:w="1656"/>
@@ -10883,6 +11309,9 @@
         </w:tc>
       </w:tr>
       <w:tr>
+        <w:trPr>
+          <w:cantSplit/>
+        </w:trPr>
         <w:tc>
           <w:tcPr>
             <w:tcW w:type="dxa" w:w="1656"/>
@@ -10953,6 +11382,9 @@
         </w:tc>
       </w:tr>
       <w:tr>
+        <w:trPr>
+          <w:cantSplit/>
+        </w:trPr>
         <w:tc>
           <w:tcPr>
             <w:tcW w:type="dxa" w:w="1656"/>
@@ -11023,6 +11455,9 @@
         </w:tc>
       </w:tr>
       <w:tr>
+        <w:trPr>
+          <w:cantSplit/>
+        </w:trPr>
         <w:tc>
           <w:tcPr>
             <w:tcW w:type="dxa" w:w="1656"/>
@@ -11093,6 +11528,9 @@
         </w:tc>
       </w:tr>
       <w:tr>
+        <w:trPr>
+          <w:cantSplit/>
+        </w:trPr>
         <w:tc>
           <w:tcPr>
             <w:tcW w:type="dxa" w:w="1656"/>
@@ -11163,6 +11601,9 @@
         </w:tc>
       </w:tr>
       <w:tr>
+        <w:trPr>
+          <w:cantSplit/>
+        </w:trPr>
         <w:tc>
           <w:tcPr>
             <w:tcW w:type="dxa" w:w="1656"/>
@@ -11233,6 +11674,9 @@
         </w:tc>
       </w:tr>
       <w:tr>
+        <w:trPr>
+          <w:cantSplit/>
+        </w:trPr>
         <w:tc>
           <w:tcPr>
             <w:tcW w:type="dxa" w:w="1656"/>
@@ -11303,6 +11747,9 @@
         </w:tc>
       </w:tr>
       <w:tr>
+        <w:trPr>
+          <w:cantSplit/>
+        </w:trPr>
         <w:tc>
           <w:tcPr>
             <w:tcW w:type="dxa" w:w="1656"/>
@@ -11373,6 +11820,9 @@
         </w:tc>
       </w:tr>
       <w:tr>
+        <w:trPr>
+          <w:cantSplit/>
+        </w:trPr>
         <w:tc>
           <w:tcPr>
             <w:tcW w:type="dxa" w:w="1656"/>
@@ -11443,6 +11893,9 @@
         </w:tc>
       </w:tr>
       <w:tr>
+        <w:trPr>
+          <w:cantSplit/>
+        </w:trPr>
         <w:tc>
           <w:tcPr>
             <w:tcW w:type="dxa" w:w="1656"/>
@@ -11513,6 +11966,9 @@
         </w:tc>
       </w:tr>
       <w:tr>
+        <w:trPr>
+          <w:cantSplit/>
+        </w:trPr>
         <w:tc>
           <w:tcPr>
             <w:tcW w:type="dxa" w:w="1656"/>
@@ -11583,6 +12039,9 @@
         </w:tc>
       </w:tr>
       <w:tr>
+        <w:trPr>
+          <w:cantSplit/>
+        </w:trPr>
         <w:tc>
           <w:tcPr>
             <w:tcW w:type="dxa" w:w="1656"/>
@@ -11653,6 +12112,9 @@
         </w:tc>
       </w:tr>
       <w:tr>
+        <w:trPr>
+          <w:cantSplit/>
+        </w:trPr>
         <w:tc>
           <w:tcPr>
             <w:tcW w:type="dxa" w:w="1656"/>
@@ -11723,6 +12185,9 @@
         </w:tc>
       </w:tr>
       <w:tr>
+        <w:trPr>
+          <w:cantSplit/>
+        </w:trPr>
         <w:tc>
           <w:tcPr>
             <w:tcW w:type="dxa" w:w="1656"/>
@@ -11793,6 +12258,9 @@
         </w:tc>
       </w:tr>
       <w:tr>
+        <w:trPr>
+          <w:cantSplit/>
+        </w:trPr>
         <w:tc>
           <w:tcPr>
             <w:tcW w:type="dxa" w:w="1656"/>
@@ -11863,6 +12331,9 @@
         </w:tc>
       </w:tr>
       <w:tr>
+        <w:trPr>
+          <w:cantSplit/>
+        </w:trPr>
         <w:tc>
           <w:tcPr>
             <w:tcW w:type="dxa" w:w="1656"/>
@@ -11933,6 +12404,9 @@
         </w:tc>
       </w:tr>
       <w:tr>
+        <w:trPr>
+          <w:cantSplit/>
+        </w:trPr>
         <w:tc>
           <w:tcPr>
             <w:tcW w:type="dxa" w:w="1656"/>
@@ -12003,6 +12477,9 @@
         </w:tc>
       </w:tr>
       <w:tr>
+        <w:trPr>
+          <w:cantSplit/>
+        </w:trPr>
         <w:tc>
           <w:tcPr>
             <w:tcW w:type="dxa" w:w="1656"/>
@@ -12073,6 +12550,9 @@
         </w:tc>
       </w:tr>
       <w:tr>
+        <w:trPr>
+          <w:cantSplit/>
+        </w:trPr>
         <w:tc>
           <w:tcPr>
             <w:tcW w:type="dxa" w:w="1656"/>
@@ -12143,6 +12623,9 @@
         </w:tc>
       </w:tr>
       <w:tr>
+        <w:trPr>
+          <w:cantSplit/>
+        </w:trPr>
         <w:tc>
           <w:tcPr>
             <w:tcW w:type="dxa" w:w="1656"/>
@@ -12213,6 +12696,9 @@
         </w:tc>
       </w:tr>
       <w:tr>
+        <w:trPr>
+          <w:cantSplit/>
+        </w:trPr>
         <w:tc>
           <w:tcPr>
             <w:tcW w:type="dxa" w:w="1656"/>
@@ -12283,6 +12769,9 @@
         </w:tc>
       </w:tr>
       <w:tr>
+        <w:trPr>
+          <w:cantSplit/>
+        </w:trPr>
         <w:tc>
           <w:tcPr>
             <w:tcW w:type="dxa" w:w="1656"/>
@@ -12353,6 +12842,9 @@
         </w:tc>
       </w:tr>
       <w:tr>
+        <w:trPr>
+          <w:cantSplit/>
+        </w:trPr>
         <w:tc>
           <w:tcPr>
             <w:tcW w:type="dxa" w:w="1656"/>
@@ -12423,6 +12915,9 @@
         </w:tc>
       </w:tr>
       <w:tr>
+        <w:trPr>
+          <w:cantSplit/>
+        </w:trPr>
         <w:tc>
           <w:tcPr>
             <w:tcW w:type="dxa" w:w="1656"/>
@@ -12493,6 +12988,9 @@
         </w:tc>
       </w:tr>
       <w:tr>
+        <w:trPr>
+          <w:cantSplit/>
+        </w:trPr>
         <w:tc>
           <w:tcPr>
             <w:tcW w:type="dxa" w:w="1656"/>
@@ -12563,6 +13061,9 @@
         </w:tc>
       </w:tr>
       <w:tr>
+        <w:trPr>
+          <w:cantSplit/>
+        </w:trPr>
         <w:tc>
           <w:tcPr>
             <w:tcW w:type="dxa" w:w="1656"/>
@@ -12633,6 +13134,9 @@
         </w:tc>
       </w:tr>
       <w:tr>
+        <w:trPr>
+          <w:cantSplit/>
+        </w:trPr>
         <w:tc>
           <w:tcPr>
             <w:tcW w:type="dxa" w:w="1656"/>
@@ -12703,6 +13207,9 @@
         </w:tc>
       </w:tr>
       <w:tr>
+        <w:trPr>
+          <w:cantSplit/>
+        </w:trPr>
         <w:tc>
           <w:tcPr>
             <w:tcW w:type="dxa" w:w="1656"/>
@@ -12773,6 +13280,9 @@
         </w:tc>
       </w:tr>
       <w:tr>
+        <w:trPr>
+          <w:cantSplit/>
+        </w:trPr>
         <w:tc>
           <w:tcPr>
             <w:tcW w:type="dxa" w:w="1656"/>
@@ -12843,6 +13353,9 @@
         </w:tc>
       </w:tr>
       <w:tr>
+        <w:trPr>
+          <w:cantSplit/>
+        </w:trPr>
         <w:tc>
           <w:tcPr>
             <w:tcW w:type="dxa" w:w="1656"/>
@@ -12913,6 +13426,9 @@
         </w:tc>
       </w:tr>
       <w:tr>
+        <w:trPr>
+          <w:cantSplit/>
+        </w:trPr>
         <w:tc>
           <w:tcPr>
             <w:tcW w:type="dxa" w:w="1656"/>
@@ -12983,6 +13499,9 @@
         </w:tc>
       </w:tr>
       <w:tr>
+        <w:trPr>
+          <w:cantSplit/>
+        </w:trPr>
         <w:tc>
           <w:tcPr>
             <w:tcW w:type="dxa" w:w="1656"/>
@@ -13053,6 +13572,9 @@
         </w:tc>
       </w:tr>
       <w:tr>
+        <w:trPr>
+          <w:cantSplit/>
+        </w:trPr>
         <w:tc>
           <w:tcPr>
             <w:tcW w:type="dxa" w:w="1656"/>
@@ -13123,6 +13645,9 @@
         </w:tc>
       </w:tr>
       <w:tr>
+        <w:trPr>
+          <w:cantSplit/>
+        </w:trPr>
         <w:tc>
           <w:tcPr>
             <w:tcW w:type="dxa" w:w="1656"/>
@@ -13193,6 +13718,9 @@
         </w:tc>
       </w:tr>
       <w:tr>
+        <w:trPr>
+          <w:cantSplit/>
+        </w:trPr>
         <w:tc>
           <w:tcPr>
             <w:tcW w:type="dxa" w:w="1656"/>
@@ -13263,6 +13791,9 @@
         </w:tc>
       </w:tr>
       <w:tr>
+        <w:trPr>
+          <w:cantSplit/>
+        </w:trPr>
         <w:tc>
           <w:tcPr>
             <w:tcW w:type="dxa" w:w="1656"/>
@@ -13333,6 +13864,9 @@
         </w:tc>
       </w:tr>
       <w:tr>
+        <w:trPr>
+          <w:cantSplit/>
+        </w:trPr>
         <w:tc>
           <w:tcPr>
             <w:tcW w:type="dxa" w:w="1656"/>
@@ -13403,6 +13937,9 @@
         </w:tc>
       </w:tr>
       <w:tr>
+        <w:trPr>
+          <w:cantSplit/>
+        </w:trPr>
         <w:tc>
           <w:tcPr>
             <w:tcW w:type="dxa" w:w="1656"/>
@@ -13473,6 +14010,9 @@
         </w:tc>
       </w:tr>
       <w:tr>
+        <w:trPr>
+          <w:cantSplit/>
+        </w:trPr>
         <w:tc>
           <w:tcPr>
             <w:tcW w:type="dxa" w:w="1656"/>
@@ -13543,6 +14083,9 @@
         </w:tc>
       </w:tr>
       <w:tr>
+        <w:trPr>
+          <w:cantSplit/>
+        </w:trPr>
         <w:tc>
           <w:tcPr>
             <w:tcW w:type="dxa" w:w="1656"/>
@@ -13613,6 +14156,9 @@
         </w:tc>
       </w:tr>
       <w:tr>
+        <w:trPr>
+          <w:cantSplit/>
+        </w:trPr>
         <w:tc>
           <w:tcPr>
             <w:tcW w:type="dxa" w:w="1656"/>
@@ -13683,6 +14229,9 @@
         </w:tc>
       </w:tr>
       <w:tr>
+        <w:trPr>
+          <w:cantSplit/>
+        </w:trPr>
         <w:tc>
           <w:tcPr>
             <w:tcW w:type="dxa" w:w="1656"/>
@@ -13753,6 +14302,9 @@
         </w:tc>
       </w:tr>
       <w:tr>
+        <w:trPr>
+          <w:cantSplit/>
+        </w:trPr>
         <w:tc>
           <w:tcPr>
             <w:tcW w:type="dxa" w:w="1656"/>
@@ -13823,6 +14375,9 @@
         </w:tc>
       </w:tr>
       <w:tr>
+        <w:trPr>
+          <w:cantSplit/>
+        </w:trPr>
         <w:tc>
           <w:tcPr>
             <w:tcW w:type="dxa" w:w="1656"/>
@@ -13893,6 +14448,9 @@
         </w:tc>
       </w:tr>
       <w:tr>
+        <w:trPr>
+          <w:cantSplit/>
+        </w:trPr>
         <w:tc>
           <w:tcPr>
             <w:tcW w:type="dxa" w:w="1656"/>
@@ -13963,6 +14521,9 @@
         </w:tc>
       </w:tr>
       <w:tr>
+        <w:trPr>
+          <w:cantSplit/>
+        </w:trPr>
         <w:tc>
           <w:tcPr>
             <w:tcW w:type="dxa" w:w="1656"/>
@@ -14033,6 +14594,9 @@
         </w:tc>
       </w:tr>
       <w:tr>
+        <w:trPr>
+          <w:cantSplit/>
+        </w:trPr>
         <w:tc>
           <w:tcPr>
             <w:tcW w:type="dxa" w:w="1656"/>
@@ -14103,6 +14667,9 @@
         </w:tc>
       </w:tr>
       <w:tr>
+        <w:trPr>
+          <w:cantSplit/>
+        </w:trPr>
         <w:tc>
           <w:tcPr>
             <w:tcW w:type="dxa" w:w="1656"/>
@@ -14173,6 +14740,9 @@
         </w:tc>
       </w:tr>
       <w:tr>
+        <w:trPr>
+          <w:cantSplit/>
+        </w:trPr>
         <w:tc>
           <w:tcPr>
             <w:tcW w:type="dxa" w:w="1656"/>
@@ -14243,6 +14813,9 @@
         </w:tc>
       </w:tr>
       <w:tr>
+        <w:trPr>
+          <w:cantSplit/>
+        </w:trPr>
         <w:tc>
           <w:tcPr>
             <w:tcW w:type="dxa" w:w="1656"/>
@@ -14313,6 +14886,9 @@
         </w:tc>
       </w:tr>
       <w:tr>
+        <w:trPr>
+          <w:cantSplit/>
+        </w:trPr>
         <w:tc>
           <w:tcPr>
             <w:tcW w:type="dxa" w:w="1656"/>
@@ -14383,6 +14959,9 @@
         </w:tc>
       </w:tr>
       <w:tr>
+        <w:trPr>
+          <w:cantSplit/>
+        </w:trPr>
         <w:tc>
           <w:tcPr>
             <w:tcW w:type="dxa" w:w="1656"/>
@@ -14453,6 +15032,9 @@
         </w:tc>
       </w:tr>
       <w:tr>
+        <w:trPr>
+          <w:cantSplit/>
+        </w:trPr>
         <w:tc>
           <w:tcPr>
             <w:tcW w:type="dxa" w:w="1656"/>
@@ -14523,6 +15105,9 @@
         </w:tc>
       </w:tr>
       <w:tr>
+        <w:trPr>
+          <w:cantSplit/>
+        </w:trPr>
         <w:tc>
           <w:tcPr>
             <w:tcW w:type="dxa" w:w="1656"/>
@@ -14593,6 +15178,9 @@
         </w:tc>
       </w:tr>
       <w:tr>
+        <w:trPr>
+          <w:cantSplit/>
+        </w:trPr>
         <w:tc>
           <w:tcPr>
             <w:tcW w:type="dxa" w:w="1656"/>
@@ -14663,6 +15251,9 @@
         </w:tc>
       </w:tr>
       <w:tr>
+        <w:trPr>
+          <w:cantSplit/>
+        </w:trPr>
         <w:tc>
           <w:tcPr>
             <w:tcW w:type="dxa" w:w="1656"/>
@@ -14733,6 +15324,9 @@
         </w:tc>
       </w:tr>
       <w:tr>
+        <w:trPr>
+          <w:cantSplit/>
+        </w:trPr>
         <w:tc>
           <w:tcPr>
             <w:tcW w:type="dxa" w:w="1656"/>
@@ -14803,6 +15397,9 @@
         </w:tc>
       </w:tr>
       <w:tr>
+        <w:trPr>
+          <w:cantSplit/>
+        </w:trPr>
         <w:tc>
           <w:tcPr>
             <w:tcW w:type="dxa" w:w="1656"/>
@@ -14873,6 +15470,9 @@
         </w:tc>
       </w:tr>
       <w:tr>
+        <w:trPr>
+          <w:cantSplit/>
+        </w:trPr>
         <w:tc>
           <w:tcPr>
             <w:tcW w:type="dxa" w:w="1656"/>
@@ -14943,6 +15543,9 @@
         </w:tc>
       </w:tr>
       <w:tr>
+        <w:trPr>
+          <w:cantSplit/>
+        </w:trPr>
         <w:tc>
           <w:tcPr>
             <w:tcW w:type="dxa" w:w="1656"/>
@@ -15013,6 +15616,9 @@
         </w:tc>
       </w:tr>
       <w:tr>
+        <w:trPr>
+          <w:cantSplit/>
+        </w:trPr>
         <w:tc>
           <w:tcPr>
             <w:tcW w:type="dxa" w:w="1656"/>
@@ -15083,6 +15689,9 @@
         </w:tc>
       </w:tr>
       <w:tr>
+        <w:trPr>
+          <w:cantSplit/>
+        </w:trPr>
         <w:tc>
           <w:tcPr>
             <w:tcW w:type="dxa" w:w="1656"/>
@@ -15153,6 +15762,9 @@
         </w:tc>
       </w:tr>
       <w:tr>
+        <w:trPr>
+          <w:cantSplit/>
+        </w:trPr>
         <w:tc>
           <w:tcPr>
             <w:tcW w:type="dxa" w:w="1656"/>
@@ -15223,6 +15835,9 @@
         </w:tc>
       </w:tr>
       <w:tr>
+        <w:trPr>
+          <w:cantSplit/>
+        </w:trPr>
         <w:tc>
           <w:tcPr>
             <w:tcW w:type="dxa" w:w="1656"/>
@@ -15293,6 +15908,9 @@
         </w:tc>
       </w:tr>
       <w:tr>
+        <w:trPr>
+          <w:cantSplit/>
+        </w:trPr>
         <w:tc>
           <w:tcPr>
             <w:tcW w:type="dxa" w:w="1656"/>
@@ -15363,6 +15981,9 @@
         </w:tc>
       </w:tr>
       <w:tr>
+        <w:trPr>
+          <w:cantSplit/>
+        </w:trPr>
         <w:tc>
           <w:tcPr>
             <w:tcW w:type="dxa" w:w="1656"/>
@@ -15433,6 +16054,9 @@
         </w:tc>
       </w:tr>
       <w:tr>
+        <w:trPr>
+          <w:cantSplit/>
+        </w:trPr>
         <w:tc>
           <w:tcPr>
             <w:tcW w:type="dxa" w:w="1656"/>
@@ -15503,6 +16127,9 @@
         </w:tc>
       </w:tr>
       <w:tr>
+        <w:trPr>
+          <w:cantSplit/>
+        </w:trPr>
         <w:tc>
           <w:tcPr>
             <w:tcW w:type="dxa" w:w="1656"/>
@@ -15573,6 +16200,9 @@
         </w:tc>
       </w:tr>
       <w:tr>
+        <w:trPr>
+          <w:cantSplit/>
+        </w:trPr>
         <w:tc>
           <w:tcPr>
             <w:tcW w:type="dxa" w:w="1656"/>
@@ -15643,6 +16273,9 @@
         </w:tc>
       </w:tr>
       <w:tr>
+        <w:trPr>
+          <w:cantSplit/>
+        </w:trPr>
         <w:tc>
           <w:tcPr>
             <w:tcW w:type="dxa" w:w="1656"/>
@@ -15713,6 +16346,9 @@
         </w:tc>
       </w:tr>
       <w:tr>
+        <w:trPr>
+          <w:cantSplit/>
+        </w:trPr>
         <w:tc>
           <w:tcPr>
             <w:tcW w:type="dxa" w:w="1656"/>
@@ -15783,6 +16419,9 @@
         </w:tc>
       </w:tr>
       <w:tr>
+        <w:trPr>
+          <w:cantSplit/>
+        </w:trPr>
         <w:tc>
           <w:tcPr>
             <w:tcW w:type="dxa" w:w="1656"/>
@@ -15853,6 +16492,9 @@
         </w:tc>
       </w:tr>
       <w:tr>
+        <w:trPr>
+          <w:cantSplit/>
+        </w:trPr>
         <w:tc>
           <w:tcPr>
             <w:tcW w:type="dxa" w:w="1656"/>
@@ -15923,6 +16565,9 @@
         </w:tc>
       </w:tr>
       <w:tr>
+        <w:trPr>
+          <w:cantSplit/>
+        </w:trPr>
         <w:tc>
           <w:tcPr>
             <w:tcW w:type="dxa" w:w="1656"/>
@@ -15993,6 +16638,9 @@
         </w:tc>
       </w:tr>
       <w:tr>
+        <w:trPr>
+          <w:cantSplit/>
+        </w:trPr>
         <w:tc>
           <w:tcPr>
             <w:tcW w:type="dxa" w:w="1656"/>
@@ -16063,6 +16711,9 @@
         </w:tc>
       </w:tr>
       <w:tr>
+        <w:trPr>
+          <w:cantSplit/>
+        </w:trPr>
         <w:tc>
           <w:tcPr>
             <w:tcW w:type="dxa" w:w="1656"/>
@@ -16133,6 +16784,9 @@
         </w:tc>
       </w:tr>
       <w:tr>
+        <w:trPr>
+          <w:cantSplit/>
+        </w:trPr>
         <w:tc>
           <w:tcPr>
             <w:tcW w:type="dxa" w:w="1656"/>
@@ -16203,6 +16857,9 @@
         </w:tc>
       </w:tr>
       <w:tr>
+        <w:trPr>
+          <w:cantSplit/>
+        </w:trPr>
         <w:tc>
           <w:tcPr>
             <w:tcW w:type="dxa" w:w="1656"/>
@@ -16273,6 +16930,9 @@
         </w:tc>
       </w:tr>
       <w:tr>
+        <w:trPr>
+          <w:cantSplit/>
+        </w:trPr>
         <w:tc>
           <w:tcPr>
             <w:tcW w:type="dxa" w:w="1656"/>
@@ -16343,6 +17003,9 @@
         </w:tc>
       </w:tr>
       <w:tr>
+        <w:trPr>
+          <w:cantSplit/>
+        </w:trPr>
         <w:tc>
           <w:tcPr>
             <w:tcW w:type="dxa" w:w="1656"/>
@@ -16413,6 +17076,9 @@
         </w:tc>
       </w:tr>
       <w:tr>
+        <w:trPr>
+          <w:cantSplit/>
+        </w:trPr>
         <w:tc>
           <w:tcPr>
             <w:tcW w:type="dxa" w:w="1656"/>
@@ -16483,6 +17149,9 @@
         </w:tc>
       </w:tr>
       <w:tr>
+        <w:trPr>
+          <w:cantSplit/>
+        </w:trPr>
         <w:tc>
           <w:tcPr>
             <w:tcW w:type="dxa" w:w="1656"/>
@@ -16553,6 +17222,9 @@
         </w:tc>
       </w:tr>
       <w:tr>
+        <w:trPr>
+          <w:cantSplit/>
+        </w:trPr>
         <w:tc>
           <w:tcPr>
             <w:tcW w:type="dxa" w:w="1656"/>
@@ -16623,6 +17295,9 @@
         </w:tc>
       </w:tr>
       <w:tr>
+        <w:trPr>
+          <w:cantSplit/>
+        </w:trPr>
         <w:tc>
           <w:tcPr>
             <w:tcW w:type="dxa" w:w="1656"/>
@@ -16693,6 +17368,9 @@
         </w:tc>
       </w:tr>
       <w:tr>
+        <w:trPr>
+          <w:cantSplit/>
+        </w:trPr>
         <w:tc>
           <w:tcPr>
             <w:tcW w:type="dxa" w:w="1656"/>
@@ -16763,6 +17441,9 @@
         </w:tc>
       </w:tr>
       <w:tr>
+        <w:trPr>
+          <w:cantSplit/>
+        </w:trPr>
         <w:tc>
           <w:tcPr>
             <w:tcW w:type="dxa" w:w="1656"/>
@@ -16833,6 +17514,9 @@
         </w:tc>
       </w:tr>
       <w:tr>
+        <w:trPr>
+          <w:cantSplit/>
+        </w:trPr>
         <w:tc>
           <w:tcPr>
             <w:tcW w:type="dxa" w:w="1656"/>
@@ -16903,6 +17587,9 @@
         </w:tc>
       </w:tr>
       <w:tr>
+        <w:trPr>
+          <w:cantSplit/>
+        </w:trPr>
         <w:tc>
           <w:tcPr>
             <w:tcW w:type="dxa" w:w="1656"/>
@@ -16973,6 +17660,9 @@
         </w:tc>
       </w:tr>
       <w:tr>
+        <w:trPr>
+          <w:cantSplit/>
+        </w:trPr>
         <w:tc>
           <w:tcPr>
             <w:tcW w:type="dxa" w:w="1656"/>
@@ -17043,6 +17733,9 @@
         </w:tc>
       </w:tr>
       <w:tr>
+        <w:trPr>
+          <w:cantSplit/>
+        </w:trPr>
         <w:tc>
           <w:tcPr>
             <w:tcW w:type="dxa" w:w="1656"/>
@@ -17113,6 +17806,9 @@
         </w:tc>
       </w:tr>
       <w:tr>
+        <w:trPr>
+          <w:cantSplit/>
+        </w:trPr>
         <w:tc>
           <w:tcPr>
             <w:tcW w:type="dxa" w:w="1656"/>
@@ -17183,6 +17879,9 @@
         </w:tc>
       </w:tr>
       <w:tr>
+        <w:trPr>
+          <w:cantSplit/>
+        </w:trPr>
         <w:tc>
           <w:tcPr>
             <w:tcW w:type="dxa" w:w="1656"/>
@@ -17253,6 +17952,9 @@
         </w:tc>
       </w:tr>
       <w:tr>
+        <w:trPr>
+          <w:cantSplit/>
+        </w:trPr>
         <w:tc>
           <w:tcPr>
             <w:tcW w:type="dxa" w:w="1656"/>
@@ -17323,6 +18025,9 @@
         </w:tc>
       </w:tr>
       <w:tr>
+        <w:trPr>
+          <w:cantSplit/>
+        </w:trPr>
         <w:tc>
           <w:tcPr>
             <w:tcW w:type="dxa" w:w="1656"/>
@@ -17393,6 +18098,9 @@
         </w:tc>
       </w:tr>
       <w:tr>
+        <w:trPr>
+          <w:cantSplit/>
+        </w:trPr>
         <w:tc>
           <w:tcPr>
             <w:tcW w:type="dxa" w:w="1656"/>
@@ -17463,6 +18171,9 @@
         </w:tc>
       </w:tr>
       <w:tr>
+        <w:trPr>
+          <w:cantSplit/>
+        </w:trPr>
         <w:tc>
           <w:tcPr>
             <w:tcW w:type="dxa" w:w="1656"/>
@@ -17533,6 +18244,9 @@
         </w:tc>
       </w:tr>
       <w:tr>
+        <w:trPr>
+          <w:cantSplit/>
+        </w:trPr>
         <w:tc>
           <w:tcPr>
             <w:tcW w:type="dxa" w:w="1656"/>
@@ -17603,6 +18317,9 @@
         </w:tc>
       </w:tr>
       <w:tr>
+        <w:trPr>
+          <w:cantSplit/>
+        </w:trPr>
         <w:tc>
           <w:tcPr>
             <w:tcW w:type="dxa" w:w="1656"/>
@@ -17673,6 +18390,9 @@
         </w:tc>
       </w:tr>
       <w:tr>
+        <w:trPr>
+          <w:cantSplit/>
+        </w:trPr>
         <w:tc>
           <w:tcPr>
             <w:tcW w:type="dxa" w:w="1656"/>
@@ -17743,6 +18463,9 @@
         </w:tc>
       </w:tr>
       <w:tr>
+        <w:trPr>
+          <w:cantSplit/>
+        </w:trPr>
         <w:tc>
           <w:tcPr>
             <w:tcW w:type="dxa" w:w="1656"/>
@@ -17813,6 +18536,9 @@
         </w:tc>
       </w:tr>
       <w:tr>
+        <w:trPr>
+          <w:cantSplit/>
+        </w:trPr>
         <w:tc>
           <w:tcPr>
             <w:tcW w:type="dxa" w:w="1656"/>
@@ -17883,6 +18609,9 @@
         </w:tc>
       </w:tr>
       <w:tr>
+        <w:trPr>
+          <w:cantSplit/>
+        </w:trPr>
         <w:tc>
           <w:tcPr>
             <w:tcW w:type="dxa" w:w="1656"/>
@@ -17953,6 +18682,9 @@
         </w:tc>
       </w:tr>
       <w:tr>
+        <w:trPr>
+          <w:cantSplit/>
+        </w:trPr>
         <w:tc>
           <w:tcPr>
             <w:tcW w:type="dxa" w:w="1656"/>
@@ -18023,6 +18755,9 @@
         </w:tc>
       </w:tr>
       <w:tr>
+        <w:trPr>
+          <w:cantSplit/>
+        </w:trPr>
         <w:tc>
           <w:tcPr>
             <w:tcW w:type="dxa" w:w="1656"/>
@@ -18093,6 +18828,9 @@
         </w:tc>
       </w:tr>
       <w:tr>
+        <w:trPr>
+          <w:cantSplit/>
+        </w:trPr>
         <w:tc>
           <w:tcPr>
             <w:tcW w:type="dxa" w:w="1656"/>
@@ -18163,6 +18901,9 @@
         </w:tc>
       </w:tr>
       <w:tr>
+        <w:trPr>
+          <w:cantSplit/>
+        </w:trPr>
         <w:tc>
           <w:tcPr>
             <w:tcW w:type="dxa" w:w="1656"/>
@@ -18233,6 +18974,9 @@
         </w:tc>
       </w:tr>
       <w:tr>
+        <w:trPr>
+          <w:cantSplit/>
+        </w:trPr>
         <w:tc>
           <w:tcPr>
             <w:tcW w:type="dxa" w:w="1656"/>
@@ -18303,6 +19047,9 @@
         </w:tc>
       </w:tr>
       <w:tr>
+        <w:trPr>
+          <w:cantSplit/>
+        </w:trPr>
         <w:tc>
           <w:tcPr>
             <w:tcW w:type="dxa" w:w="1656"/>
@@ -18373,6 +19120,9 @@
         </w:tc>
       </w:tr>
       <w:tr>
+        <w:trPr>
+          <w:cantSplit/>
+        </w:trPr>
         <w:tc>
           <w:tcPr>
             <w:tcW w:type="dxa" w:w="1656"/>
@@ -18443,6 +19193,9 @@
         </w:tc>
       </w:tr>
       <w:tr>
+        <w:trPr>
+          <w:cantSplit/>
+        </w:trPr>
         <w:tc>
           <w:tcPr>
             <w:tcW w:type="dxa" w:w="1656"/>
@@ -18513,6 +19266,9 @@
         </w:tc>
       </w:tr>
       <w:tr>
+        <w:trPr>
+          <w:cantSplit/>
+        </w:trPr>
         <w:tc>
           <w:tcPr>
             <w:tcW w:type="dxa" w:w="1656"/>
@@ -18583,6 +19339,9 @@
         </w:tc>
       </w:tr>
       <w:tr>
+        <w:trPr>
+          <w:cantSplit/>
+        </w:trPr>
         <w:tc>
           <w:tcPr>
             <w:tcW w:type="dxa" w:w="1656"/>
@@ -18653,6 +19412,9 @@
         </w:tc>
       </w:tr>
       <w:tr>
+        <w:trPr>
+          <w:cantSplit/>
+        </w:trPr>
         <w:tc>
           <w:tcPr>
             <w:tcW w:type="dxa" w:w="1656"/>
@@ -18723,6 +19485,9 @@
         </w:tc>
       </w:tr>
       <w:tr>
+        <w:trPr>
+          <w:cantSplit/>
+        </w:trPr>
         <w:tc>
           <w:tcPr>
             <w:tcW w:type="dxa" w:w="1656"/>
@@ -18793,6 +19558,9 @@
         </w:tc>
       </w:tr>
       <w:tr>
+        <w:trPr>
+          <w:cantSplit/>
+        </w:trPr>
         <w:tc>
           <w:tcPr>
             <w:tcW w:type="dxa" w:w="1656"/>
@@ -18863,6 +19631,9 @@
         </w:tc>
       </w:tr>
       <w:tr>
+        <w:trPr>
+          <w:cantSplit/>
+        </w:trPr>
         <w:tc>
           <w:tcPr>
             <w:tcW w:type="dxa" w:w="1656"/>
@@ -18933,6 +19704,9 @@
         </w:tc>
       </w:tr>
       <w:tr>
+        <w:trPr>
+          <w:cantSplit/>
+        </w:trPr>
         <w:tc>
           <w:tcPr>
             <w:tcW w:type="dxa" w:w="1656"/>
@@ -19003,6 +19777,9 @@
         </w:tc>
       </w:tr>
       <w:tr>
+        <w:trPr>
+          <w:cantSplit/>
+        </w:trPr>
         <w:tc>
           <w:tcPr>
             <w:tcW w:type="dxa" w:w="1656"/>
@@ -19073,6 +19850,9 @@
         </w:tc>
       </w:tr>
       <w:tr>
+        <w:trPr>
+          <w:cantSplit/>
+        </w:trPr>
         <w:tc>
           <w:tcPr>
             <w:tcW w:type="dxa" w:w="1656"/>
@@ -19143,6 +19923,9 @@
         </w:tc>
       </w:tr>
       <w:tr>
+        <w:trPr>
+          <w:cantSplit/>
+        </w:trPr>
         <w:tc>
           <w:tcPr>
             <w:tcW w:type="dxa" w:w="1656"/>
@@ -19213,6 +19996,9 @@
         </w:tc>
       </w:tr>
       <w:tr>
+        <w:trPr>
+          <w:cantSplit/>
+        </w:trPr>
         <w:tc>
           <w:tcPr>
             <w:tcW w:type="dxa" w:w="1656"/>
@@ -19283,6 +20069,9 @@
         </w:tc>
       </w:tr>
       <w:tr>
+        <w:trPr>
+          <w:cantSplit/>
+        </w:trPr>
         <w:tc>
           <w:tcPr>
             <w:tcW w:type="dxa" w:w="1656"/>
@@ -19353,6 +20142,9 @@
         </w:tc>
       </w:tr>
       <w:tr>
+        <w:trPr>
+          <w:cantSplit/>
+        </w:trPr>
         <w:tc>
           <w:tcPr>
             <w:tcW w:type="dxa" w:w="1656"/>
@@ -19423,6 +20215,9 @@
         </w:tc>
       </w:tr>
       <w:tr>
+        <w:trPr>
+          <w:cantSplit/>
+        </w:trPr>
         <w:tc>
           <w:tcPr>
             <w:tcW w:type="dxa" w:w="1656"/>
@@ -19493,6 +20288,9 @@
         </w:tc>
       </w:tr>
       <w:tr>
+        <w:trPr>
+          <w:cantSplit/>
+        </w:trPr>
         <w:tc>
           <w:tcPr>
             <w:tcW w:type="dxa" w:w="1656"/>
@@ -19563,6 +20361,9 @@
         </w:tc>
       </w:tr>
       <w:tr>
+        <w:trPr>
+          <w:cantSplit/>
+        </w:trPr>
         <w:tc>
           <w:tcPr>
             <w:tcW w:type="dxa" w:w="1656"/>
@@ -19633,6 +20434,9 @@
         </w:tc>
       </w:tr>
       <w:tr>
+        <w:trPr>
+          <w:cantSplit/>
+        </w:trPr>
         <w:tc>
           <w:tcPr>
             <w:tcW w:type="dxa" w:w="1656"/>
@@ -19703,6 +20507,9 @@
         </w:tc>
       </w:tr>
       <w:tr>
+        <w:trPr>
+          <w:cantSplit/>
+        </w:trPr>
         <w:tc>
           <w:tcPr>
             <w:tcW w:type="dxa" w:w="1656"/>
@@ -19773,6 +20580,9 @@
         </w:tc>
       </w:tr>
       <w:tr>
+        <w:trPr>
+          <w:cantSplit/>
+        </w:trPr>
         <w:tc>
           <w:tcPr>
             <w:tcW w:type="dxa" w:w="1656"/>
@@ -19843,6 +20653,9 @@
         </w:tc>
       </w:tr>
       <w:tr>
+        <w:trPr>
+          <w:cantSplit/>
+        </w:trPr>
         <w:tc>
           <w:tcPr>
             <w:tcW w:type="dxa" w:w="1656"/>
@@ -19913,6 +20726,9 @@
         </w:tc>
       </w:tr>
       <w:tr>
+        <w:trPr>
+          <w:cantSplit/>
+        </w:trPr>
         <w:tc>
           <w:tcPr>
             <w:tcW w:type="dxa" w:w="1656"/>
@@ -19983,6 +20799,9 @@
         </w:tc>
       </w:tr>
       <w:tr>
+        <w:trPr>
+          <w:cantSplit/>
+        </w:trPr>
         <w:tc>
           <w:tcPr>
             <w:tcW w:type="dxa" w:w="1656"/>
@@ -20053,6 +20872,9 @@
         </w:tc>
       </w:tr>
       <w:tr>
+        <w:trPr>
+          <w:cantSplit/>
+        </w:trPr>
         <w:tc>
           <w:tcPr>
             <w:tcW w:type="dxa" w:w="1656"/>
@@ -20123,6 +20945,9 @@
         </w:tc>
       </w:tr>
       <w:tr>
+        <w:trPr>
+          <w:cantSplit/>
+        </w:trPr>
         <w:tc>
           <w:tcPr>
             <w:tcW w:type="dxa" w:w="1656"/>
@@ -20193,6 +21018,9 @@
         </w:tc>
       </w:tr>
       <w:tr>
+        <w:trPr>
+          <w:cantSplit/>
+        </w:trPr>
         <w:tc>
           <w:tcPr>
             <w:tcW w:type="dxa" w:w="1656"/>
@@ -20263,6 +21091,9 @@
         </w:tc>
       </w:tr>
       <w:tr>
+        <w:trPr>
+          <w:cantSplit/>
+        </w:trPr>
         <w:tc>
           <w:tcPr>
             <w:tcW w:type="dxa" w:w="1656"/>
@@ -20333,6 +21164,9 @@
         </w:tc>
       </w:tr>
       <w:tr>
+        <w:trPr>
+          <w:cantSplit/>
+        </w:trPr>
         <w:tc>
           <w:tcPr>
             <w:tcW w:type="dxa" w:w="1656"/>
@@ -20403,6 +21237,9 @@
         </w:tc>
       </w:tr>
       <w:tr>
+        <w:trPr>
+          <w:cantSplit/>
+        </w:trPr>
         <w:tc>
           <w:tcPr>
             <w:tcW w:type="dxa" w:w="1656"/>
@@ -20473,6 +21310,9 @@
         </w:tc>
       </w:tr>
       <w:tr>
+        <w:trPr>
+          <w:cantSplit/>
+        </w:trPr>
         <w:tc>
           <w:tcPr>
             <w:tcW w:type="dxa" w:w="1656"/>
@@ -20543,6 +21383,9 @@
         </w:tc>
       </w:tr>
       <w:tr>
+        <w:trPr>
+          <w:cantSplit/>
+        </w:trPr>
         <w:tc>
           <w:tcPr>
             <w:tcW w:type="dxa" w:w="1656"/>
@@ -20613,6 +21456,9 @@
         </w:tc>
       </w:tr>
       <w:tr>
+        <w:trPr>
+          <w:cantSplit/>
+        </w:trPr>
         <w:tc>
           <w:tcPr>
             <w:tcW w:type="dxa" w:w="1656"/>
@@ -20683,6 +21529,9 @@
         </w:tc>
       </w:tr>
       <w:tr>
+        <w:trPr>
+          <w:cantSplit/>
+        </w:trPr>
         <w:tc>
           <w:tcPr>
             <w:tcW w:type="dxa" w:w="1656"/>
@@ -20753,6 +21602,9 @@
         </w:tc>
       </w:tr>
       <w:tr>
+        <w:trPr>
+          <w:cantSplit/>
+        </w:trPr>
         <w:tc>
           <w:tcPr>
             <w:tcW w:type="dxa" w:w="1656"/>
@@ -20899,6 +21751,9 @@
         <w:gridCol w:w="6048"/>
       </w:tblGrid>
       <w:tr>
+        <w:trPr>
+          <w:cantSplit/>
+        </w:trPr>
         <w:tc>
           <w:tcPr>
             <w:tcW w:type="dxa" w:w="1656"/>
@@ -20977,6 +21832,9 @@
         </w:tc>
       </w:tr>
       <w:tr>
+        <w:trPr>
+          <w:cantSplit/>
+        </w:trPr>
         <w:tc>
           <w:tcPr>
             <w:tcW w:type="dxa" w:w="1656"/>
@@ -21047,6 +21905,9 @@
         </w:tc>
       </w:tr>
       <w:tr>
+        <w:trPr>
+          <w:cantSplit/>
+        </w:trPr>
         <w:tc>
           <w:tcPr>
             <w:tcW w:type="dxa" w:w="1656"/>
@@ -21117,6 +21978,9 @@
         </w:tc>
       </w:tr>
       <w:tr>
+        <w:trPr>
+          <w:cantSplit/>
+        </w:trPr>
         <w:tc>
           <w:tcPr>
             <w:tcW w:type="dxa" w:w="1656"/>
@@ -21187,6 +22051,9 @@
         </w:tc>
       </w:tr>
       <w:tr>
+        <w:trPr>
+          <w:cantSplit/>
+        </w:trPr>
         <w:tc>
           <w:tcPr>
             <w:tcW w:type="dxa" w:w="1656"/>
@@ -21257,6 +22124,9 @@
         </w:tc>
       </w:tr>
       <w:tr>
+        <w:trPr>
+          <w:cantSplit/>
+        </w:trPr>
         <w:tc>
           <w:tcPr>
             <w:tcW w:type="dxa" w:w="1656"/>
@@ -21327,6 +22197,9 @@
         </w:tc>
       </w:tr>
       <w:tr>
+        <w:trPr>
+          <w:cantSplit/>
+        </w:trPr>
         <w:tc>
           <w:tcPr>
             <w:tcW w:type="dxa" w:w="1656"/>
@@ -21397,6 +22270,9 @@
         </w:tc>
       </w:tr>
       <w:tr>
+        <w:trPr>
+          <w:cantSplit/>
+        </w:trPr>
         <w:tc>
           <w:tcPr>
             <w:tcW w:type="dxa" w:w="1656"/>
@@ -21467,6 +22343,9 @@
         </w:tc>
       </w:tr>
       <w:tr>
+        <w:trPr>
+          <w:cantSplit/>
+        </w:trPr>
         <w:tc>
           <w:tcPr>
             <w:tcW w:type="dxa" w:w="1656"/>
@@ -21537,6 +22416,9 @@
         </w:tc>
       </w:tr>
       <w:tr>
+        <w:trPr>
+          <w:cantSplit/>
+        </w:trPr>
         <w:tc>
           <w:tcPr>
             <w:tcW w:type="dxa" w:w="1656"/>
@@ -21607,6 +22489,9 @@
         </w:tc>
       </w:tr>
       <w:tr>
+        <w:trPr>
+          <w:cantSplit/>
+        </w:trPr>
         <w:tc>
           <w:tcPr>
             <w:tcW w:type="dxa" w:w="1656"/>
@@ -21753,6 +22638,9 @@
         <w:gridCol w:w="6048"/>
       </w:tblGrid>
       <w:tr>
+        <w:trPr>
+          <w:cantSplit/>
+        </w:trPr>
         <w:tc>
           <w:tcPr>
             <w:tcW w:type="dxa" w:w="1656"/>
@@ -21831,6 +22719,9 @@
         </w:tc>
       </w:tr>
       <w:tr>
+        <w:trPr>
+          <w:cantSplit/>
+        </w:trPr>
         <w:tc>
           <w:tcPr>
             <w:tcW w:type="dxa" w:w="1656"/>
@@ -21901,6 +22792,9 @@
         </w:tc>
       </w:tr>
       <w:tr>
+        <w:trPr>
+          <w:cantSplit/>
+        </w:trPr>
         <w:tc>
           <w:tcPr>
             <w:tcW w:type="dxa" w:w="1656"/>
@@ -22047,6 +22941,9 @@
         <w:gridCol w:w="6048"/>
       </w:tblGrid>
       <w:tr>
+        <w:trPr>
+          <w:cantSplit/>
+        </w:trPr>
         <w:tc>
           <w:tcPr>
             <w:tcW w:type="dxa" w:w="1656"/>
@@ -22125,6 +23022,9 @@
         </w:tc>
       </w:tr>
       <w:tr>
+        <w:trPr>
+          <w:cantSplit/>
+        </w:trPr>
         <w:tc>
           <w:tcPr>
             <w:tcW w:type="dxa" w:w="1656"/>
@@ -22195,6 +23095,9 @@
         </w:tc>
       </w:tr>
       <w:tr>
+        <w:trPr>
+          <w:cantSplit/>
+        </w:trPr>
         <w:tc>
           <w:tcPr>
             <w:tcW w:type="dxa" w:w="1656"/>
@@ -22354,6 +23257,9 @@
         <w:gridCol w:w="3600"/>
       </w:tblGrid>
       <w:tr>
+        <w:trPr>
+          <w:cantSplit/>
+        </w:trPr>
         <w:tc>
           <w:tcPr>
             <w:tcW w:type="dxa" w:w="2088"/>
@@ -22413,6 +23319,9 @@
         </w:tc>
       </w:tr>
       <w:tr>
+        <w:trPr>
+          <w:cantSplit/>
+        </w:trPr>
         <w:tc>
           <w:tcPr>
             <w:tcW w:type="dxa" w:w="2088"/>
@@ -22468,6 +23377,9 @@
         </w:tc>
       </w:tr>
       <w:tr>
+        <w:trPr>
+          <w:cantSplit/>
+        </w:trPr>
         <w:tc>
           <w:tcPr>
             <w:tcW w:type="dxa" w:w="2088"/>
@@ -22523,6 +23435,9 @@
         </w:tc>
       </w:tr>
       <w:tr>
+        <w:trPr>
+          <w:cantSplit/>
+        </w:trPr>
         <w:tc>
           <w:tcPr>
             <w:tcW w:type="dxa" w:w="2088"/>
@@ -22578,6 +23493,9 @@
         </w:tc>
       </w:tr>
       <w:tr>
+        <w:trPr>
+          <w:cantSplit/>
+        </w:trPr>
         <w:tc>
           <w:tcPr>
             <w:tcW w:type="dxa" w:w="2088"/>
@@ -22633,6 +23551,9 @@
         </w:tc>
       </w:tr>
       <w:tr>
+        <w:trPr>
+          <w:cantSplit/>
+        </w:trPr>
         <w:tc>
           <w:tcPr>
             <w:tcW w:type="dxa" w:w="2088"/>
@@ -22688,6 +23609,9 @@
         </w:tc>
       </w:tr>
       <w:tr>
+        <w:trPr>
+          <w:cantSplit/>
+        </w:trPr>
         <w:tc>
           <w:tcPr>
             <w:tcW w:type="dxa" w:w="2088"/>
@@ -22743,6 +23667,9 @@
         </w:tc>
       </w:tr>
       <w:tr>
+        <w:trPr>
+          <w:cantSplit/>
+        </w:trPr>
         <w:tc>
           <w:tcPr>
             <w:tcW w:type="dxa" w:w="2088"/>
@@ -22798,6 +23725,9 @@
         </w:tc>
       </w:tr>
       <w:tr>
+        <w:trPr>
+          <w:cantSplit/>
+        </w:trPr>
         <w:tc>
           <w:tcPr>
             <w:tcW w:type="dxa" w:w="2088"/>
@@ -22853,6 +23783,9 @@
         </w:tc>
       </w:tr>
       <w:tr>
+        <w:trPr>
+          <w:cantSplit/>
+        </w:trPr>
         <w:tc>
           <w:tcPr>
             <w:tcW w:type="dxa" w:w="2088"/>
@@ -22908,6 +23841,9 @@
         </w:tc>
       </w:tr>
       <w:tr>
+        <w:trPr>
+          <w:cantSplit/>
+        </w:trPr>
         <w:tc>
           <w:tcPr>
             <w:tcW w:type="dxa" w:w="2088"/>
@@ -22963,6 +23899,9 @@
         </w:tc>
       </w:tr>
       <w:tr>
+        <w:trPr>
+          <w:cantSplit/>
+        </w:trPr>
         <w:tc>
           <w:tcPr>
             <w:tcW w:type="dxa" w:w="2088"/>
@@ -23018,6 +23957,9 @@
         </w:tc>
       </w:tr>
       <w:tr>
+        <w:trPr>
+          <w:cantSplit/>
+        </w:trPr>
         <w:tc>
           <w:tcPr>
             <w:tcW w:type="dxa" w:w="2088"/>
@@ -23073,6 +24015,9 @@
         </w:tc>
       </w:tr>
       <w:tr>
+        <w:trPr>
+          <w:cantSplit/>
+        </w:trPr>
         <w:tc>
           <w:tcPr>
             <w:tcW w:type="dxa" w:w="2088"/>
@@ -23128,6 +24073,9 @@
         </w:tc>
       </w:tr>
       <w:tr>
+        <w:trPr>
+          <w:cantSplit/>
+        </w:trPr>
         <w:tc>
           <w:tcPr>
             <w:tcW w:type="dxa" w:w="2088"/>
@@ -23183,6 +24131,9 @@
         </w:tc>
       </w:tr>
       <w:tr>
+        <w:trPr>
+          <w:cantSplit/>
+        </w:trPr>
         <w:tc>
           <w:tcPr>
             <w:tcW w:type="dxa" w:w="2088"/>
@@ -23313,6 +24264,9 @@
         <w:gridCol w:w="5270"/>
       </w:tblGrid>
       <w:tr>
+        <w:trPr>
+          <w:cantSplit/>
+        </w:trPr>
         <w:tc>
           <w:tcPr>
             <w:tcW w:type="dxa" w:w="2477"/>
@@ -23372,6 +24326,9 @@
         </w:tc>
       </w:tr>
       <w:tr>
+        <w:trPr>
+          <w:cantSplit/>
+        </w:trPr>
         <w:tc>
           <w:tcPr>
             <w:tcW w:type="dxa" w:w="2477"/>
@@ -23427,6 +24384,9 @@
         </w:tc>
       </w:tr>
       <w:tr>
+        <w:trPr>
+          <w:cantSplit/>
+        </w:trPr>
         <w:tc>
           <w:tcPr>
             <w:tcW w:type="dxa" w:w="2477"/>
@@ -23482,6 +24442,9 @@
         </w:tc>
       </w:tr>
       <w:tr>
+        <w:trPr>
+          <w:cantSplit/>
+        </w:trPr>
         <w:tc>
           <w:tcPr>
             <w:tcW w:type="dxa" w:w="2477"/>
@@ -23537,6 +24500,9 @@
         </w:tc>
       </w:tr>
       <w:tr>
+        <w:trPr>
+          <w:cantSplit/>
+        </w:trPr>
         <w:tc>
           <w:tcPr>
             <w:tcW w:type="dxa" w:w="2477"/>
@@ -23592,6 +24558,9 @@
         </w:tc>
       </w:tr>
       <w:tr>
+        <w:trPr>
+          <w:cantSplit/>
+        </w:trPr>
         <w:tc>
           <w:tcPr>
             <w:tcW w:type="dxa" w:w="2477"/>
@@ -23647,6 +24616,9 @@
         </w:tc>
       </w:tr>
       <w:tr>
+        <w:trPr>
+          <w:cantSplit/>
+        </w:trPr>
         <w:tc>
           <w:tcPr>
             <w:tcW w:type="dxa" w:w="2477"/>
@@ -23702,6 +24674,9 @@
         </w:tc>
       </w:tr>
       <w:tr>
+        <w:trPr>
+          <w:cantSplit/>
+        </w:trPr>
         <w:tc>
           <w:tcPr>
             <w:tcW w:type="dxa" w:w="2477"/>
@@ -23757,6 +24732,9 @@
         </w:tc>
       </w:tr>
       <w:tr>
+        <w:trPr>
+          <w:cantSplit/>
+        </w:trPr>
         <w:tc>
           <w:tcPr>
             <w:tcW w:type="dxa" w:w="2477"/>
@@ -23812,6 +24790,9 @@
         </w:tc>
       </w:tr>
       <w:tr>
+        <w:trPr>
+          <w:cantSplit/>
+        </w:trPr>
         <w:tc>
           <w:tcPr>
             <w:tcW w:type="dxa" w:w="2477"/>
@@ -23867,6 +24848,9 @@
         </w:tc>
       </w:tr>
       <w:tr>
+        <w:trPr>
+          <w:cantSplit/>
+        </w:trPr>
         <w:tc>
           <w:tcPr>
             <w:tcW w:type="dxa" w:w="2477"/>
@@ -23922,6 +24906,9 @@
         </w:tc>
       </w:tr>
       <w:tr>
+        <w:trPr>
+          <w:cantSplit/>
+        </w:trPr>
         <w:tc>
           <w:tcPr>
             <w:tcW w:type="dxa" w:w="2477"/>
@@ -23977,6 +24964,9 @@
         </w:tc>
       </w:tr>
       <w:tr>
+        <w:trPr>
+          <w:cantSplit/>
+        </w:trPr>
         <w:tc>
           <w:tcPr>
             <w:tcW w:type="dxa" w:w="2477"/>
@@ -24032,6 +25022,9 @@
         </w:tc>
       </w:tr>
       <w:tr>
+        <w:trPr>
+          <w:cantSplit/>
+        </w:trPr>
         <w:tc>
           <w:tcPr>
             <w:tcW w:type="dxa" w:w="2477"/>
@@ -24087,6 +25080,9 @@
         </w:tc>
       </w:tr>
       <w:tr>
+        <w:trPr>
+          <w:cantSplit/>
+        </w:trPr>
         <w:tc>
           <w:tcPr>
             <w:tcW w:type="dxa" w:w="2477"/>
@@ -24142,6 +25138,9 @@
         </w:tc>
       </w:tr>
       <w:tr>
+        <w:trPr>
+          <w:cantSplit/>
+        </w:trPr>
         <w:tc>
           <w:tcPr>
             <w:tcW w:type="dxa" w:w="2477"/>
@@ -24197,6 +25196,9 @@
         </w:tc>
       </w:tr>
       <w:tr>
+        <w:trPr>
+          <w:cantSplit/>
+        </w:trPr>
         <w:tc>
           <w:tcPr>
             <w:tcW w:type="dxa" w:w="2477"/>
@@ -24341,6 +25343,9 @@
         <w:gridCol w:w="3456"/>
       </w:tblGrid>
       <w:tr>
+        <w:trPr>
+          <w:cantSplit/>
+        </w:trPr>
         <w:tc>
           <w:tcPr>
             <w:tcW w:type="dxa" w:w="2160"/>
@@ -24400,6 +25405,9 @@
         </w:tc>
       </w:tr>
       <w:tr>
+        <w:trPr>
+          <w:cantSplit/>
+        </w:trPr>
         <w:tc>
           <w:tcPr>
             <w:tcW w:type="dxa" w:w="2160"/>
@@ -24455,6 +25463,9 @@
         </w:tc>
       </w:tr>
       <w:tr>
+        <w:trPr>
+          <w:cantSplit/>
+        </w:trPr>
         <w:tc>
           <w:tcPr>
             <w:tcW w:type="dxa" w:w="2160"/>
@@ -24510,6 +25521,9 @@
         </w:tc>
       </w:tr>
       <w:tr>
+        <w:trPr>
+          <w:cantSplit/>
+        </w:trPr>
         <w:tc>
           <w:tcPr>
             <w:tcW w:type="dxa" w:w="2160"/>
@@ -24565,6 +25579,9 @@
         </w:tc>
       </w:tr>
       <w:tr>
+        <w:trPr>
+          <w:cantSplit/>
+        </w:trPr>
         <w:tc>
           <w:tcPr>
             <w:tcW w:type="dxa" w:w="2160"/>
@@ -24620,6 +25637,9 @@
         </w:tc>
       </w:tr>
       <w:tr>
+        <w:trPr>
+          <w:cantSplit/>
+        </w:trPr>
         <w:tc>
           <w:tcPr>
             <w:tcW w:type="dxa" w:w="2160"/>
@@ -24675,6 +25695,9 @@
         </w:tc>
       </w:tr>
       <w:tr>
+        <w:trPr>
+          <w:cantSplit/>
+        </w:trPr>
         <w:tc>
           <w:tcPr>
             <w:tcW w:type="dxa" w:w="2160"/>
@@ -24730,6 +25753,9 @@
         </w:tc>
       </w:tr>
       <w:tr>
+        <w:trPr>
+          <w:cantSplit/>
+        </w:trPr>
         <w:tc>
           <w:tcPr>
             <w:tcW w:type="dxa" w:w="2160"/>
@@ -24785,6 +25811,9 @@
         </w:tc>
       </w:tr>
       <w:tr>
+        <w:trPr>
+          <w:cantSplit/>
+        </w:trPr>
         <w:tc>
           <w:tcPr>
             <w:tcW w:type="dxa" w:w="2160"/>
@@ -24840,6 +25869,9 @@
         </w:tc>
       </w:tr>
       <w:tr>
+        <w:trPr>
+          <w:cantSplit/>
+        </w:trPr>
         <w:tc>
           <w:tcPr>
             <w:tcW w:type="dxa" w:w="2160"/>
@@ -24895,6 +25927,9 @@
         </w:tc>
       </w:tr>
       <w:tr>
+        <w:trPr>
+          <w:cantSplit/>
+        </w:trPr>
         <w:tc>
           <w:tcPr>
             <w:tcW w:type="dxa" w:w="2160"/>
@@ -24950,6 +25985,9 @@
         </w:tc>
       </w:tr>
       <w:tr>
+        <w:trPr>
+          <w:cantSplit/>
+        </w:trPr>
         <w:tc>
           <w:tcPr>
             <w:tcW w:type="dxa" w:w="2160"/>
@@ -25080,6 +26118,9 @@
         <w:gridCol w:w="3528"/>
       </w:tblGrid>
       <w:tr>
+        <w:trPr>
+          <w:cantSplit/>
+        </w:trPr>
         <w:tc>
           <w:tcPr>
             <w:tcW w:type="dxa" w:w="2160"/>
@@ -25139,6 +26180,9 @@
         </w:tc>
       </w:tr>
       <w:tr>
+        <w:trPr>
+          <w:cantSplit/>
+        </w:trPr>
         <w:tc>
           <w:tcPr>
             <w:tcW w:type="dxa" w:w="2160"/>
@@ -25194,6 +26238,9 @@
         </w:tc>
       </w:tr>
       <w:tr>
+        <w:trPr>
+          <w:cantSplit/>
+        </w:trPr>
         <w:tc>
           <w:tcPr>
             <w:tcW w:type="dxa" w:w="2160"/>
@@ -25249,6 +26296,9 @@
         </w:tc>
       </w:tr>
       <w:tr>
+        <w:trPr>
+          <w:cantSplit/>
+        </w:trPr>
         <w:tc>
           <w:tcPr>
             <w:tcW w:type="dxa" w:w="2160"/>
@@ -25304,6 +26354,9 @@
         </w:tc>
       </w:tr>
       <w:tr>
+        <w:trPr>
+          <w:cantSplit/>
+        </w:trPr>
         <w:tc>
           <w:tcPr>
             <w:tcW w:type="dxa" w:w="2160"/>
@@ -25359,6 +26412,9 @@
         </w:tc>
       </w:tr>
       <w:tr>
+        <w:trPr>
+          <w:cantSplit/>
+        </w:trPr>
         <w:tc>
           <w:tcPr>
             <w:tcW w:type="dxa" w:w="2160"/>
@@ -25414,6 +26470,9 @@
         </w:tc>
       </w:tr>
       <w:tr>
+        <w:trPr>
+          <w:cantSplit/>
+        </w:trPr>
         <w:tc>
           <w:tcPr>
             <w:tcW w:type="dxa" w:w="2160"/>
@@ -25469,6 +26528,9 @@
         </w:tc>
       </w:tr>
       <w:tr>
+        <w:trPr>
+          <w:cantSplit/>
+        </w:trPr>
         <w:tc>
           <w:tcPr>
             <w:tcW w:type="dxa" w:w="2160"/>

</xml_diff>